<commit_message>
docs: knowledge files updated post-g8 + john-batch + Phase 8 (01-07)
</commit_message>
<xml_diff>
--- a/documentation/07-promotion-criteria.md.docx
+++ b/documentation/07-promotion-criteria.md.docx
@@ -780,7 +780,7 @@
         <w:rPr>
           <w:rtl w:val="0"/>
         </w:rPr>
-        <w:t xml:space="preserve"> — Grey/White, Grey/Black, etc. require schema work (G9 Phase 2)</w:t>
+        <w:t xml:space="preserve"> — BK map com 13 IBJJF compostos + dropdown Add Student implementados (john-batch) ✅; PROMO_CRITERIA cobre White → Orange/White ✅; Orange, Orange/Black, Green/White, Green, Green/Black aguardando John/Mario ⏳</w:t>
       </w:r>
     </w:p>
     <w:p>
@@ -857,7 +857,7 @@
         <w:rPr>
           <w:rtl w:val="0"/>
         </w:rPr>
-        <w:t xml:space="preserve"> — Orange, Orange/Black, Green variants (awaiting from John + Mario)</w:t>
+        <w:t xml:space="preserve"> — Orange, Orange/Black, Green variants (pendente desde 18 May 2026; awaiting from John + Mario)</w:t>
       </w:r>
     </w:p>
     <w:p>

</xml_diff>